<commit_message>
Report: HV comprehension questions
</commit_message>
<xml_diff>
--- a/files/EEN442_Lab_Report_Template.docx
+++ b/files/EEN442_Lab_Report_Template.docx
@@ -173,7 +173,7 @@
               <w:rPr>
                 <w:sz w:val="20"/>
               </w:rPr>
-              <w:t>Part 1: max. 3 pages. Part 2: max. 4 pages. Part 3: max. 2 pages. The limits include text, tables and plots. The cover information, Appendix A (photographs) and Appendix B (raw measurement tables) do not count.</w:t>
+              <w:t>Part 1: max. 2 pages. Part 2: max. 4 pages. Part 3: max. 2 pages. The limits include text, tables and plots. The cover information, Appendix A (photographs) and Appendix B (raw measurement tables) do not count.</w:t>
             </w:r>
           </w:p>
           <w:p>
@@ -191,7 +191,7 @@
               <w:rPr>
                 <w:sz w:val="20"/>
               </w:rPr>
-              <w:t>Number and caption every figure and table, label all axes with quantity and unit, and use SI units. Plots should be generated from your measured data.</w:t>
+              <w:t>Number and caption every figure and table, label all axes with quantity and unit, and use SI units. Plots in Parts 2 and 3 should be generated from your measured data.</w:t>
             </w:r>
           </w:p>
         </w:tc>
@@ -414,7 +414,7 @@
         <w:pStyle w:val="Heading1"/>
       </w:pPr>
       <w:r>
-        <w:t>Part 1: High Voltage Laboratory. Breakdown Strength in Air</w:t>
+        <w:t>Part 1: High Voltage Laboratory. Comprehension Questions</w:t>
       </w:r>
     </w:p>
     <w:p>
@@ -424,15 +424,7 @@
           <w:i/>
           <w:sz w:val="20"/>
         </w:rPr>
-        <w:t>Maximum 3 pages</w:t>
-      </w:r>
-    </w:p>
-    <w:p>
-      <w:pPr>
-        <w:pStyle w:val="Heading2"/>
-      </w:pPr>
-      <w:r>
-        <w:t>1.1 Experimental Setup Description</w:t>
+        <w:t>Maximum 2 pages</w:t>
       </w:r>
     </w:p>
     <w:p>
@@ -441,76 +433,7 @@
           <w:b w:val="0"/>
           <w:i w:val="0"/>
         </w:rPr>
-        <w:t>Describe the high voltage test setup used in your experiment, including all major components and their functions. Address the following points:</w:t>
-      </w:r>
-    </w:p>
-    <w:p>
-      <w:pPr>
-        <w:pStyle w:val="ListBullet"/>
-      </w:pPr>
-      <w:r>
-        <w:t>Main components of the AC test circuit: variable transformer (ST), 100 kV high voltage transformer (HS), 100 pF measuring capacitor (CM) and 50 kΩ series resistor (RV)</w:t>
-      </w:r>
-    </w:p>
-    <w:p>
-      <w:pPr>
-        <w:pStyle w:val="ListBullet"/>
-      </w:pPr>
-      <w:r>
-        <w:t>Modifications for the DC tests: rectifier diodes (GD), 10 000 pF DC capacitor (CS) and earthing switch with 416 Ω resistor (ES)</w:t>
-      </w:r>
-    </w:p>
-    <w:p>
-      <w:pPr>
-        <w:pStyle w:val="ListBullet"/>
-      </w:pPr>
-      <w:r>
-        <w:t>Safety systems and grounding equipment employed, and the safety briefing procedure</w:t>
-      </w:r>
-    </w:p>
-    <w:p>
-      <w:pPr>
-        <w:pStyle w:val="ListBullet"/>
-      </w:pPr>
-      <w:r>
-        <w:t>The measurement and control instruments used to acquire breakdown voltages (AC peak and DC measurement)</w:t>
-      </w:r>
-    </w:p>
-    <w:p>
-      <w:pPr>
-        <w:pStyle w:val="ListBullet"/>
-      </w:pPr>
-      <w:r>
-        <w:t>How the electrode configurations (plate-plate, point-plate, point-point) were assembled and the gap distance set</w:t>
-      </w:r>
-    </w:p>
-    <w:p>
-      <w:pPr>
-        <w:pStyle w:val="ListBullet"/>
-      </w:pPr>
-      <w:r>
-        <w:t>The voltage ramp-up procedure and breakdown detection method</w:t>
-      </w:r>
-    </w:p>
-    <w:p>
-      <w:pPr>
-        <w:pStyle w:val="ListBullet"/>
-      </w:pPr>
-      <w:r>
-        <w:t>Environmental conditions during the experiment (temperature, pressure, humidity, if recorded)</w:t>
-      </w:r>
-    </w:p>
-    <w:p>
-      <w:pPr>
-        <w:spacing w:after="200"/>
-      </w:pPr>
-      <w:r>
-        <w:rPr>
-          <w:b w:val="0"/>
-          <w:i/>
-          <w:color w:val="808080"/>
-        </w:rPr>
-        <w:t>[Write your setup description here.]</w:t>
+        <w:t>Answer each question in a few sentences, based on what you saw in the demonstrations and the partial discharge experiment. The HV lab introduction and the two HV handouts on the lab week site give the background.</w:t>
       </w:r>
     </w:p>
     <w:p>
@@ -518,2605 +441,7 @@
         <w:pStyle w:val="Heading2"/>
       </w:pPr>
       <w:r>
-        <w:t>1.2 Measurement Results and Breakdown Characteristics</w:t>
-      </w:r>
-    </w:p>
-    <w:p>
-      <w:r>
-        <w:rPr>
-          <w:b w:val="0"/>
-          <w:i w:val="0"/>
-        </w:rPr>
-        <w:t>Report the breakdown voltage Û_d as a peak value in kV. For each AC measurement, calculate the mean field strength, the geometry factor, the utilisation factor and the maximum field strength:</w:t>
-      </w:r>
-    </w:p>
-    <w:p>
-      <w:pPr>
-        <w:spacing w:after="80"/>
-        <w:ind w:left="567"/>
-      </w:pPr>
-      <w:r>
-        <w:rPr>
-          <w:rFonts w:ascii="Cambria Math" w:hAnsi="Cambria Math"/>
-          <w:b w:val="0"/>
-          <w:i w:val="0"/>
-        </w:rPr>
-        <w:t>E_mean = Û_d / s        p = (s + r) / r  (equivalent point radius r = 0.5 mm)</w:t>
-      </w:r>
-    </w:p>
-    <w:p>
-      <w:pPr>
-        <w:spacing w:after="80"/>
-        <w:ind w:left="567"/>
-      </w:pPr>
-      <w:r>
-        <w:rPr>
-          <w:rFonts w:ascii="Cambria Math" w:hAnsi="Cambria Math"/>
-          <w:b w:val="0"/>
-          <w:i w:val="0"/>
-        </w:rPr>
-        <w:t>η = E_mean / E_max  (for plate-plate the field is homogeneous, so η = 100 % and p is not used; η(p) for point-plate from the Schwaiger diagram in the lecture notes)        E_max = E_mean / η</w:t>
-      </w:r>
-    </w:p>
-    <w:p>
-      <w:pPr>
-        <w:spacing w:after="40"/>
-      </w:pPr>
-      <w:r>
-        <w:rPr>
-          <w:b/>
-          <w:i w:val="0"/>
-          <w:sz w:val="20"/>
-        </w:rPr>
-        <w:t>Table 1.1: AC breakdown voltages of air (Part 1a)</w:t>
-      </w:r>
-    </w:p>
-    <w:tbl>
-      <w:tblPr>
-        <w:tblStyle w:val="TableGrid"/>
-        <w:tblW w:type="auto" w:w="0"/>
-        <w:jc w:val="center"/>
-        <w:tblLook w:firstColumn="1" w:firstRow="1" w:lastColumn="0" w:lastRow="0" w:noHBand="0" w:noVBand="1" w:val="04A0"/>
-      </w:tblPr>
-      <w:tblGrid>
-        <w:gridCol w:w="1392"/>
-        <w:gridCol w:w="1392"/>
-        <w:gridCol w:w="1392"/>
-        <w:gridCol w:w="1392"/>
-        <w:gridCol w:w="1392"/>
-        <w:gridCol w:w="1392"/>
-        <w:gridCol w:w="1392"/>
-      </w:tblGrid>
-      <w:tr>
-        <w:tc>
-          <w:tcPr>
-            <w:tcW w:type="dxa" w:w="1587"/>
-            <w:shd w:val="clear" w:color="auto" w:fill="DCE4EE"/>
-          </w:tcPr>
-          <w:p>
-            <w:r/>
-            <w:r>
-              <w:rPr>
-                <w:b/>
-                <w:sz w:val="19"/>
-              </w:rPr>
-              <w:t>Geometry</w:t>
-            </w:r>
-          </w:p>
-        </w:tc>
-        <w:tc>
-          <w:tcPr>
-            <w:tcW w:type="dxa" w:w="907"/>
-            <w:shd w:val="clear" w:color="auto" w:fill="DCE4EE"/>
-          </w:tcPr>
-          <w:p>
-            <w:r/>
-            <w:r>
-              <w:rPr>
-                <w:b/>
-                <w:sz w:val="19"/>
-              </w:rPr>
-              <w:t>s / mm</w:t>
-            </w:r>
-          </w:p>
-        </w:tc>
-        <w:tc>
-          <w:tcPr>
-            <w:tcW w:type="dxa" w:w="1134"/>
-            <w:shd w:val="clear" w:color="auto" w:fill="DCE4EE"/>
-          </w:tcPr>
-          <w:p>
-            <w:r/>
-            <w:r>
-              <w:rPr>
-                <w:b/>
-                <w:sz w:val="19"/>
-              </w:rPr>
-              <w:t>Û_d / kV</w:t>
-            </w:r>
-          </w:p>
-        </w:tc>
-        <w:tc>
-          <w:tcPr>
-            <w:tcW w:type="dxa" w:w="1587"/>
-            <w:shd w:val="clear" w:color="auto" w:fill="DCE4EE"/>
-          </w:tcPr>
-          <w:p>
-            <w:r/>
-            <w:r>
-              <w:rPr>
-                <w:b/>
-                <w:sz w:val="19"/>
-              </w:rPr>
-              <w:t>E_mean / (kV/cm)</w:t>
-            </w:r>
-          </w:p>
-        </w:tc>
-        <w:tc>
-          <w:tcPr>
-            <w:tcW w:type="dxa" w:w="1474"/>
-            <w:shd w:val="clear" w:color="auto" w:fill="DCE4EE"/>
-          </w:tcPr>
-          <w:p>
-            <w:r/>
-            <w:r>
-              <w:rPr>
-                <w:b/>
-                <w:sz w:val="19"/>
-              </w:rPr>
-              <w:t>p</w:t>
-            </w:r>
-          </w:p>
-        </w:tc>
-        <w:tc>
-          <w:tcPr>
-            <w:tcW w:type="dxa" w:w="1020"/>
-            <w:shd w:val="clear" w:color="auto" w:fill="DCE4EE"/>
-          </w:tcPr>
-          <w:p>
-            <w:r/>
-            <w:r>
-              <w:rPr>
-                <w:b/>
-                <w:sz w:val="19"/>
-              </w:rPr>
-              <w:t>η / %</w:t>
-            </w:r>
-          </w:p>
-        </w:tc>
-        <w:tc>
-          <w:tcPr>
-            <w:tcW w:type="dxa" w:w="1587"/>
-            <w:shd w:val="clear" w:color="auto" w:fill="DCE4EE"/>
-          </w:tcPr>
-          <w:p>
-            <w:r/>
-            <w:r>
-              <w:rPr>
-                <w:b/>
-                <w:sz w:val="19"/>
-              </w:rPr>
-              <w:t>E_max / (kV/cm)</w:t>
-            </w:r>
-          </w:p>
-        </w:tc>
-      </w:tr>
-      <w:tr>
-        <w:tc>
-          <w:tcPr>
-            <w:tcW w:type="dxa" w:w="1587"/>
-          </w:tcPr>
-          <w:p>
-            <w:r/>
-            <w:r>
-              <w:rPr>
-                <w:sz w:val="19"/>
-              </w:rPr>
-              <w:t>Plate-plate</w:t>
-            </w:r>
-          </w:p>
-        </w:tc>
-        <w:tc>
-          <w:tcPr>
-            <w:tcW w:type="dxa" w:w="907"/>
-          </w:tcPr>
-          <w:p>
-            <w:r/>
-            <w:r>
-              <w:rPr>
-                <w:sz w:val="19"/>
-              </w:rPr>
-              <w:t>10</w:t>
-            </w:r>
-          </w:p>
-        </w:tc>
-        <w:tc>
-          <w:tcPr>
-            <w:tcW w:type="dxa" w:w="1134"/>
-          </w:tcPr>
-          <w:p>
-            <w:r/>
-            <w:r>
-              <w:rPr>
-                <w:sz w:val="19"/>
-              </w:rPr>
-            </w:r>
-          </w:p>
-        </w:tc>
-        <w:tc>
-          <w:tcPr>
-            <w:tcW w:type="dxa" w:w="1587"/>
-          </w:tcPr>
-          <w:p>
-            <w:r/>
-            <w:r>
-              <w:rPr>
-                <w:sz w:val="19"/>
-              </w:rPr>
-            </w:r>
-          </w:p>
-        </w:tc>
-        <w:tc>
-          <w:tcPr>
-            <w:tcW w:type="dxa" w:w="1474"/>
-          </w:tcPr>
-          <w:p>
-            <w:r/>
-            <w:r>
-              <w:rPr>
-                <w:sz w:val="19"/>
-              </w:rPr>
-              <w:t>n/a</w:t>
-            </w:r>
-          </w:p>
-        </w:tc>
-        <w:tc>
-          <w:tcPr>
-            <w:tcW w:type="dxa" w:w="1020"/>
-          </w:tcPr>
-          <w:p>
-            <w:r/>
-            <w:r>
-              <w:rPr>
-                <w:sz w:val="19"/>
-              </w:rPr>
-              <w:t>100</w:t>
-            </w:r>
-          </w:p>
-        </w:tc>
-        <w:tc>
-          <w:tcPr>
-            <w:tcW w:type="dxa" w:w="1587"/>
-          </w:tcPr>
-          <w:p>
-            <w:r/>
-            <w:r>
-              <w:rPr>
-                <w:sz w:val="19"/>
-              </w:rPr>
-            </w:r>
-          </w:p>
-        </w:tc>
-      </w:tr>
-      <w:tr>
-        <w:tc>
-          <w:tcPr>
-            <w:tcW w:type="dxa" w:w="1587"/>
-          </w:tcPr>
-          <w:p>
-            <w:r/>
-            <w:r>
-              <w:rPr>
-                <w:sz w:val="19"/>
-              </w:rPr>
-              <w:t>Plate-plate</w:t>
-            </w:r>
-          </w:p>
-        </w:tc>
-        <w:tc>
-          <w:tcPr>
-            <w:tcW w:type="dxa" w:w="907"/>
-          </w:tcPr>
-          <w:p>
-            <w:r/>
-            <w:r>
-              <w:rPr>
-                <w:sz w:val="19"/>
-              </w:rPr>
-              <w:t>20</w:t>
-            </w:r>
-          </w:p>
-        </w:tc>
-        <w:tc>
-          <w:tcPr>
-            <w:tcW w:type="dxa" w:w="1134"/>
-          </w:tcPr>
-          <w:p>
-            <w:r/>
-            <w:r>
-              <w:rPr>
-                <w:sz w:val="19"/>
-              </w:rPr>
-            </w:r>
-          </w:p>
-        </w:tc>
-        <w:tc>
-          <w:tcPr>
-            <w:tcW w:type="dxa" w:w="1587"/>
-          </w:tcPr>
-          <w:p>
-            <w:r/>
-            <w:r>
-              <w:rPr>
-                <w:sz w:val="19"/>
-              </w:rPr>
-            </w:r>
-          </w:p>
-        </w:tc>
-        <w:tc>
-          <w:tcPr>
-            <w:tcW w:type="dxa" w:w="1474"/>
-          </w:tcPr>
-          <w:p>
-            <w:r/>
-            <w:r>
-              <w:rPr>
-                <w:sz w:val="19"/>
-              </w:rPr>
-              <w:t>n/a</w:t>
-            </w:r>
-          </w:p>
-        </w:tc>
-        <w:tc>
-          <w:tcPr>
-            <w:tcW w:type="dxa" w:w="1020"/>
-          </w:tcPr>
-          <w:p>
-            <w:r/>
-            <w:r>
-              <w:rPr>
-                <w:sz w:val="19"/>
-              </w:rPr>
-              <w:t>100</w:t>
-            </w:r>
-          </w:p>
-        </w:tc>
-        <w:tc>
-          <w:tcPr>
-            <w:tcW w:type="dxa" w:w="1587"/>
-          </w:tcPr>
-          <w:p>
-            <w:r/>
-            <w:r>
-              <w:rPr>
-                <w:sz w:val="19"/>
-              </w:rPr>
-            </w:r>
-          </w:p>
-        </w:tc>
-      </w:tr>
-      <w:tr>
-        <w:tc>
-          <w:tcPr>
-            <w:tcW w:type="dxa" w:w="1587"/>
-          </w:tcPr>
-          <w:p>
-            <w:r/>
-            <w:r>
-              <w:rPr>
-                <w:sz w:val="19"/>
-              </w:rPr>
-              <w:t>Plate-plate</w:t>
-            </w:r>
-          </w:p>
-        </w:tc>
-        <w:tc>
-          <w:tcPr>
-            <w:tcW w:type="dxa" w:w="907"/>
-          </w:tcPr>
-          <w:p>
-            <w:r/>
-            <w:r>
-              <w:rPr>
-                <w:sz w:val="19"/>
-              </w:rPr>
-              <w:t>30</w:t>
-            </w:r>
-          </w:p>
-        </w:tc>
-        <w:tc>
-          <w:tcPr>
-            <w:tcW w:type="dxa" w:w="1134"/>
-          </w:tcPr>
-          <w:p>
-            <w:r/>
-            <w:r>
-              <w:rPr>
-                <w:sz w:val="19"/>
-              </w:rPr>
-            </w:r>
-          </w:p>
-        </w:tc>
-        <w:tc>
-          <w:tcPr>
-            <w:tcW w:type="dxa" w:w="1587"/>
-          </w:tcPr>
-          <w:p>
-            <w:r/>
-            <w:r>
-              <w:rPr>
-                <w:sz w:val="19"/>
-              </w:rPr>
-            </w:r>
-          </w:p>
-        </w:tc>
-        <w:tc>
-          <w:tcPr>
-            <w:tcW w:type="dxa" w:w="1474"/>
-          </w:tcPr>
-          <w:p>
-            <w:r/>
-            <w:r>
-              <w:rPr>
-                <w:sz w:val="19"/>
-              </w:rPr>
-              <w:t>n/a</w:t>
-            </w:r>
-          </w:p>
-        </w:tc>
-        <w:tc>
-          <w:tcPr>
-            <w:tcW w:type="dxa" w:w="1020"/>
-          </w:tcPr>
-          <w:p>
-            <w:r/>
-            <w:r>
-              <w:rPr>
-                <w:sz w:val="19"/>
-              </w:rPr>
-              <w:t>100</w:t>
-            </w:r>
-          </w:p>
-        </w:tc>
-        <w:tc>
-          <w:tcPr>
-            <w:tcW w:type="dxa" w:w="1587"/>
-          </w:tcPr>
-          <w:p>
-            <w:r/>
-            <w:r>
-              <w:rPr>
-                <w:sz w:val="19"/>
-              </w:rPr>
-            </w:r>
-          </w:p>
-        </w:tc>
-      </w:tr>
-      <w:tr>
-        <w:tc>
-          <w:tcPr>
-            <w:tcW w:type="dxa" w:w="1587"/>
-          </w:tcPr>
-          <w:p>
-            <w:r/>
-            <w:r>
-              <w:rPr>
-                <w:sz w:val="19"/>
-              </w:rPr>
-              <w:t>Plate-plate</w:t>
-            </w:r>
-          </w:p>
-        </w:tc>
-        <w:tc>
-          <w:tcPr>
-            <w:tcW w:type="dxa" w:w="907"/>
-          </w:tcPr>
-          <w:p>
-            <w:r/>
-            <w:r>
-              <w:rPr>
-                <w:sz w:val="19"/>
-              </w:rPr>
-              <w:t>40</w:t>
-            </w:r>
-          </w:p>
-        </w:tc>
-        <w:tc>
-          <w:tcPr>
-            <w:tcW w:type="dxa" w:w="1134"/>
-          </w:tcPr>
-          <w:p>
-            <w:r/>
-            <w:r>
-              <w:rPr>
-                <w:sz w:val="19"/>
-              </w:rPr>
-            </w:r>
-          </w:p>
-        </w:tc>
-        <w:tc>
-          <w:tcPr>
-            <w:tcW w:type="dxa" w:w="1587"/>
-          </w:tcPr>
-          <w:p>
-            <w:r/>
-            <w:r>
-              <w:rPr>
-                <w:sz w:val="19"/>
-              </w:rPr>
-            </w:r>
-          </w:p>
-        </w:tc>
-        <w:tc>
-          <w:tcPr>
-            <w:tcW w:type="dxa" w:w="1474"/>
-          </w:tcPr>
-          <w:p>
-            <w:r/>
-            <w:r>
-              <w:rPr>
-                <w:sz w:val="19"/>
-              </w:rPr>
-              <w:t>n/a</w:t>
-            </w:r>
-          </w:p>
-        </w:tc>
-        <w:tc>
-          <w:tcPr>
-            <w:tcW w:type="dxa" w:w="1020"/>
-          </w:tcPr>
-          <w:p>
-            <w:r/>
-            <w:r>
-              <w:rPr>
-                <w:sz w:val="19"/>
-              </w:rPr>
-              <w:t>100</w:t>
-            </w:r>
-          </w:p>
-        </w:tc>
-        <w:tc>
-          <w:tcPr>
-            <w:tcW w:type="dxa" w:w="1587"/>
-          </w:tcPr>
-          <w:p>
-            <w:r/>
-            <w:r>
-              <w:rPr>
-                <w:sz w:val="19"/>
-              </w:rPr>
-            </w:r>
-          </w:p>
-        </w:tc>
-      </w:tr>
-      <w:tr>
-        <w:tc>
-          <w:tcPr>
-            <w:tcW w:type="dxa" w:w="1587"/>
-          </w:tcPr>
-          <w:p>
-            <w:r/>
-            <w:r>
-              <w:rPr>
-                <w:sz w:val="19"/>
-              </w:rPr>
-              <w:t>Plate-plate</w:t>
-            </w:r>
-          </w:p>
-        </w:tc>
-        <w:tc>
-          <w:tcPr>
-            <w:tcW w:type="dxa" w:w="907"/>
-          </w:tcPr>
-          <w:p>
-            <w:r/>
-            <w:r>
-              <w:rPr>
-                <w:sz w:val="19"/>
-              </w:rPr>
-              <w:t>50</w:t>
-            </w:r>
-          </w:p>
-        </w:tc>
-        <w:tc>
-          <w:tcPr>
-            <w:tcW w:type="dxa" w:w="1134"/>
-          </w:tcPr>
-          <w:p>
-            <w:r/>
-            <w:r>
-              <w:rPr>
-                <w:sz w:val="19"/>
-              </w:rPr>
-            </w:r>
-          </w:p>
-        </w:tc>
-        <w:tc>
-          <w:tcPr>
-            <w:tcW w:type="dxa" w:w="1587"/>
-          </w:tcPr>
-          <w:p>
-            <w:r/>
-            <w:r>
-              <w:rPr>
-                <w:sz w:val="19"/>
-              </w:rPr>
-            </w:r>
-          </w:p>
-        </w:tc>
-        <w:tc>
-          <w:tcPr>
-            <w:tcW w:type="dxa" w:w="1474"/>
-          </w:tcPr>
-          <w:p>
-            <w:r/>
-            <w:r>
-              <w:rPr>
-                <w:sz w:val="19"/>
-              </w:rPr>
-              <w:t>n/a</w:t>
-            </w:r>
-          </w:p>
-        </w:tc>
-        <w:tc>
-          <w:tcPr>
-            <w:tcW w:type="dxa" w:w="1020"/>
-          </w:tcPr>
-          <w:p>
-            <w:r/>
-            <w:r>
-              <w:rPr>
-                <w:sz w:val="19"/>
-              </w:rPr>
-              <w:t>100</w:t>
-            </w:r>
-          </w:p>
-        </w:tc>
-        <w:tc>
-          <w:tcPr>
-            <w:tcW w:type="dxa" w:w="1587"/>
-          </w:tcPr>
-          <w:p>
-            <w:r/>
-            <w:r>
-              <w:rPr>
-                <w:sz w:val="19"/>
-              </w:rPr>
-            </w:r>
-          </w:p>
-        </w:tc>
-      </w:tr>
-      <w:tr>
-        <w:tc>
-          <w:tcPr>
-            <w:tcW w:type="dxa" w:w="1587"/>
-          </w:tcPr>
-          <w:p>
-            <w:r/>
-            <w:r>
-              <w:rPr>
-                <w:sz w:val="19"/>
-              </w:rPr>
-              <w:t>Plate-plate</w:t>
-            </w:r>
-          </w:p>
-        </w:tc>
-        <w:tc>
-          <w:tcPr>
-            <w:tcW w:type="dxa" w:w="907"/>
-          </w:tcPr>
-          <w:p>
-            <w:r/>
-            <w:r>
-              <w:rPr>
-                <w:sz w:val="19"/>
-              </w:rPr>
-              <w:t>60</w:t>
-            </w:r>
-          </w:p>
-        </w:tc>
-        <w:tc>
-          <w:tcPr>
-            <w:tcW w:type="dxa" w:w="1134"/>
-          </w:tcPr>
-          <w:p>
-            <w:r/>
-            <w:r>
-              <w:rPr>
-                <w:sz w:val="19"/>
-              </w:rPr>
-            </w:r>
-          </w:p>
-        </w:tc>
-        <w:tc>
-          <w:tcPr>
-            <w:tcW w:type="dxa" w:w="1587"/>
-          </w:tcPr>
-          <w:p>
-            <w:r/>
-            <w:r>
-              <w:rPr>
-                <w:sz w:val="19"/>
-              </w:rPr>
-            </w:r>
-          </w:p>
-        </w:tc>
-        <w:tc>
-          <w:tcPr>
-            <w:tcW w:type="dxa" w:w="1474"/>
-          </w:tcPr>
-          <w:p>
-            <w:r/>
-            <w:r>
-              <w:rPr>
-                <w:sz w:val="19"/>
-              </w:rPr>
-              <w:t>n/a</w:t>
-            </w:r>
-          </w:p>
-        </w:tc>
-        <w:tc>
-          <w:tcPr>
-            <w:tcW w:type="dxa" w:w="1020"/>
-          </w:tcPr>
-          <w:p>
-            <w:r/>
-            <w:r>
-              <w:rPr>
-                <w:sz w:val="19"/>
-              </w:rPr>
-              <w:t>100</w:t>
-            </w:r>
-          </w:p>
-        </w:tc>
-        <w:tc>
-          <w:tcPr>
-            <w:tcW w:type="dxa" w:w="1587"/>
-          </w:tcPr>
-          <w:p>
-            <w:r/>
-            <w:r>
-              <w:rPr>
-                <w:sz w:val="19"/>
-              </w:rPr>
-            </w:r>
-          </w:p>
-        </w:tc>
-      </w:tr>
-      <w:tr>
-        <w:tc>
-          <w:tcPr>
-            <w:tcW w:type="dxa" w:w="1587"/>
-          </w:tcPr>
-          <w:p>
-            <w:r/>
-            <w:r>
-              <w:rPr>
-                <w:sz w:val="19"/>
-              </w:rPr>
-              <w:t>Point-plate</w:t>
-            </w:r>
-          </w:p>
-        </w:tc>
-        <w:tc>
-          <w:tcPr>
-            <w:tcW w:type="dxa" w:w="907"/>
-          </w:tcPr>
-          <w:p>
-            <w:r/>
-            <w:r>
-              <w:rPr>
-                <w:sz w:val="19"/>
-              </w:rPr>
-              <w:t>30</w:t>
-            </w:r>
-          </w:p>
-        </w:tc>
-        <w:tc>
-          <w:tcPr>
-            <w:tcW w:type="dxa" w:w="1134"/>
-          </w:tcPr>
-          <w:p>
-            <w:r/>
-            <w:r>
-              <w:rPr>
-                <w:sz w:val="19"/>
-              </w:rPr>
-            </w:r>
-          </w:p>
-        </w:tc>
-        <w:tc>
-          <w:tcPr>
-            <w:tcW w:type="dxa" w:w="1587"/>
-          </w:tcPr>
-          <w:p>
-            <w:r/>
-            <w:r>
-              <w:rPr>
-                <w:sz w:val="19"/>
-              </w:rPr>
-            </w:r>
-          </w:p>
-        </w:tc>
-        <w:tc>
-          <w:tcPr>
-            <w:tcW w:type="dxa" w:w="1474"/>
-          </w:tcPr>
-          <w:p>
-            <w:r/>
-            <w:r>
-              <w:rPr>
-                <w:sz w:val="19"/>
-              </w:rPr>
-            </w:r>
-          </w:p>
-        </w:tc>
-        <w:tc>
-          <w:tcPr>
-            <w:tcW w:type="dxa" w:w="1020"/>
-          </w:tcPr>
-          <w:p>
-            <w:r/>
-            <w:r>
-              <w:rPr>
-                <w:sz w:val="19"/>
-              </w:rPr>
-            </w:r>
-          </w:p>
-        </w:tc>
-        <w:tc>
-          <w:tcPr>
-            <w:tcW w:type="dxa" w:w="1587"/>
-          </w:tcPr>
-          <w:p>
-            <w:r/>
-            <w:r>
-              <w:rPr>
-                <w:sz w:val="19"/>
-              </w:rPr>
-            </w:r>
-          </w:p>
-        </w:tc>
-      </w:tr>
-      <w:tr>
-        <w:tc>
-          <w:tcPr>
-            <w:tcW w:type="dxa" w:w="1587"/>
-          </w:tcPr>
-          <w:p>
-            <w:r/>
-            <w:r>
-              <w:rPr>
-                <w:sz w:val="19"/>
-              </w:rPr>
-              <w:t>Point-plate</w:t>
-            </w:r>
-          </w:p>
-        </w:tc>
-        <w:tc>
-          <w:tcPr>
-            <w:tcW w:type="dxa" w:w="907"/>
-          </w:tcPr>
-          <w:p>
-            <w:r/>
-            <w:r>
-              <w:rPr>
-                <w:sz w:val="19"/>
-              </w:rPr>
-              <w:t>40</w:t>
-            </w:r>
-          </w:p>
-        </w:tc>
-        <w:tc>
-          <w:tcPr>
-            <w:tcW w:type="dxa" w:w="1134"/>
-          </w:tcPr>
-          <w:p>
-            <w:r/>
-            <w:r>
-              <w:rPr>
-                <w:sz w:val="19"/>
-              </w:rPr>
-            </w:r>
-          </w:p>
-        </w:tc>
-        <w:tc>
-          <w:tcPr>
-            <w:tcW w:type="dxa" w:w="1587"/>
-          </w:tcPr>
-          <w:p>
-            <w:r/>
-            <w:r>
-              <w:rPr>
-                <w:sz w:val="19"/>
-              </w:rPr>
-            </w:r>
-          </w:p>
-        </w:tc>
-        <w:tc>
-          <w:tcPr>
-            <w:tcW w:type="dxa" w:w="1474"/>
-          </w:tcPr>
-          <w:p>
-            <w:r/>
-            <w:r>
-              <w:rPr>
-                <w:sz w:val="19"/>
-              </w:rPr>
-            </w:r>
-          </w:p>
-        </w:tc>
-        <w:tc>
-          <w:tcPr>
-            <w:tcW w:type="dxa" w:w="1020"/>
-          </w:tcPr>
-          <w:p>
-            <w:r/>
-            <w:r>
-              <w:rPr>
-                <w:sz w:val="19"/>
-              </w:rPr>
-            </w:r>
-          </w:p>
-        </w:tc>
-        <w:tc>
-          <w:tcPr>
-            <w:tcW w:type="dxa" w:w="1587"/>
-          </w:tcPr>
-          <w:p>
-            <w:r/>
-            <w:r>
-              <w:rPr>
-                <w:sz w:val="19"/>
-              </w:rPr>
-            </w:r>
-          </w:p>
-        </w:tc>
-      </w:tr>
-      <w:tr>
-        <w:tc>
-          <w:tcPr>
-            <w:tcW w:type="dxa" w:w="1587"/>
-          </w:tcPr>
-          <w:p>
-            <w:r/>
-            <w:r>
-              <w:rPr>
-                <w:sz w:val="19"/>
-              </w:rPr>
-              <w:t>Point-plate</w:t>
-            </w:r>
-          </w:p>
-        </w:tc>
-        <w:tc>
-          <w:tcPr>
-            <w:tcW w:type="dxa" w:w="907"/>
-          </w:tcPr>
-          <w:p>
-            <w:r/>
-            <w:r>
-              <w:rPr>
-                <w:sz w:val="19"/>
-              </w:rPr>
-              <w:t>50</w:t>
-            </w:r>
-          </w:p>
-        </w:tc>
-        <w:tc>
-          <w:tcPr>
-            <w:tcW w:type="dxa" w:w="1134"/>
-          </w:tcPr>
-          <w:p>
-            <w:r/>
-            <w:r>
-              <w:rPr>
-                <w:sz w:val="19"/>
-              </w:rPr>
-            </w:r>
-          </w:p>
-        </w:tc>
-        <w:tc>
-          <w:tcPr>
-            <w:tcW w:type="dxa" w:w="1587"/>
-          </w:tcPr>
-          <w:p>
-            <w:r/>
-            <w:r>
-              <w:rPr>
-                <w:sz w:val="19"/>
-              </w:rPr>
-            </w:r>
-          </w:p>
-        </w:tc>
-        <w:tc>
-          <w:tcPr>
-            <w:tcW w:type="dxa" w:w="1474"/>
-          </w:tcPr>
-          <w:p>
-            <w:r/>
-            <w:r>
-              <w:rPr>
-                <w:sz w:val="19"/>
-              </w:rPr>
-            </w:r>
-          </w:p>
-        </w:tc>
-        <w:tc>
-          <w:tcPr>
-            <w:tcW w:type="dxa" w:w="1020"/>
-          </w:tcPr>
-          <w:p>
-            <w:r/>
-            <w:r>
-              <w:rPr>
-                <w:sz w:val="19"/>
-              </w:rPr>
-            </w:r>
-          </w:p>
-        </w:tc>
-        <w:tc>
-          <w:tcPr>
-            <w:tcW w:type="dxa" w:w="1587"/>
-          </w:tcPr>
-          <w:p>
-            <w:r/>
-            <w:r>
-              <w:rPr>
-                <w:sz w:val="19"/>
-              </w:rPr>
-            </w:r>
-          </w:p>
-        </w:tc>
-      </w:tr>
-      <w:tr>
-        <w:tc>
-          <w:tcPr>
-            <w:tcW w:type="dxa" w:w="1587"/>
-          </w:tcPr>
-          <w:p>
-            <w:r/>
-            <w:r>
-              <w:rPr>
-                <w:sz w:val="19"/>
-              </w:rPr>
-              <w:t>Point-plate</w:t>
-            </w:r>
-          </w:p>
-        </w:tc>
-        <w:tc>
-          <w:tcPr>
-            <w:tcW w:type="dxa" w:w="907"/>
-          </w:tcPr>
-          <w:p>
-            <w:r/>
-            <w:r>
-              <w:rPr>
-                <w:sz w:val="19"/>
-              </w:rPr>
-              <w:t>70</w:t>
-            </w:r>
-          </w:p>
-        </w:tc>
-        <w:tc>
-          <w:tcPr>
-            <w:tcW w:type="dxa" w:w="1134"/>
-          </w:tcPr>
-          <w:p>
-            <w:r/>
-            <w:r>
-              <w:rPr>
-                <w:sz w:val="19"/>
-              </w:rPr>
-            </w:r>
-          </w:p>
-        </w:tc>
-        <w:tc>
-          <w:tcPr>
-            <w:tcW w:type="dxa" w:w="1587"/>
-          </w:tcPr>
-          <w:p>
-            <w:r/>
-            <w:r>
-              <w:rPr>
-                <w:sz w:val="19"/>
-              </w:rPr>
-            </w:r>
-          </w:p>
-        </w:tc>
-        <w:tc>
-          <w:tcPr>
-            <w:tcW w:type="dxa" w:w="1474"/>
-          </w:tcPr>
-          <w:p>
-            <w:r/>
-            <w:r>
-              <w:rPr>
-                <w:sz w:val="19"/>
-              </w:rPr>
-            </w:r>
-          </w:p>
-        </w:tc>
-        <w:tc>
-          <w:tcPr>
-            <w:tcW w:type="dxa" w:w="1020"/>
-          </w:tcPr>
-          <w:p>
-            <w:r/>
-            <w:r>
-              <w:rPr>
-                <w:sz w:val="19"/>
-              </w:rPr>
-            </w:r>
-          </w:p>
-        </w:tc>
-        <w:tc>
-          <w:tcPr>
-            <w:tcW w:type="dxa" w:w="1587"/>
-          </w:tcPr>
-          <w:p>
-            <w:r/>
-            <w:r>
-              <w:rPr>
-                <w:sz w:val="19"/>
-              </w:rPr>
-            </w:r>
-          </w:p>
-        </w:tc>
-      </w:tr>
-      <w:tr>
-        <w:tc>
-          <w:tcPr>
-            <w:tcW w:type="dxa" w:w="1587"/>
-          </w:tcPr>
-          <w:p>
-            <w:r/>
-            <w:r>
-              <w:rPr>
-                <w:sz w:val="19"/>
-              </w:rPr>
-              <w:t>Point-plate</w:t>
-            </w:r>
-          </w:p>
-        </w:tc>
-        <w:tc>
-          <w:tcPr>
-            <w:tcW w:type="dxa" w:w="907"/>
-          </w:tcPr>
-          <w:p>
-            <w:r/>
-            <w:r>
-              <w:rPr>
-                <w:sz w:val="19"/>
-              </w:rPr>
-              <w:t>100</w:t>
-            </w:r>
-          </w:p>
-        </w:tc>
-        <w:tc>
-          <w:tcPr>
-            <w:tcW w:type="dxa" w:w="1134"/>
-          </w:tcPr>
-          <w:p>
-            <w:r/>
-            <w:r>
-              <w:rPr>
-                <w:sz w:val="19"/>
-              </w:rPr>
-            </w:r>
-          </w:p>
-        </w:tc>
-        <w:tc>
-          <w:tcPr>
-            <w:tcW w:type="dxa" w:w="1587"/>
-          </w:tcPr>
-          <w:p>
-            <w:r/>
-            <w:r>
-              <w:rPr>
-                <w:sz w:val="19"/>
-              </w:rPr>
-            </w:r>
-          </w:p>
-        </w:tc>
-        <w:tc>
-          <w:tcPr>
-            <w:tcW w:type="dxa" w:w="1474"/>
-          </w:tcPr>
-          <w:p>
-            <w:r/>
-            <w:r>
-              <w:rPr>
-                <w:sz w:val="19"/>
-              </w:rPr>
-            </w:r>
-          </w:p>
-        </w:tc>
-        <w:tc>
-          <w:tcPr>
-            <w:tcW w:type="dxa" w:w="1020"/>
-          </w:tcPr>
-          <w:p>
-            <w:r/>
-            <w:r>
-              <w:rPr>
-                <w:sz w:val="19"/>
-              </w:rPr>
-            </w:r>
-          </w:p>
-        </w:tc>
-        <w:tc>
-          <w:tcPr>
-            <w:tcW w:type="dxa" w:w="1587"/>
-          </w:tcPr>
-          <w:p>
-            <w:r/>
-            <w:r>
-              <w:rPr>
-                <w:sz w:val="19"/>
-              </w:rPr>
-            </w:r>
-          </w:p>
-        </w:tc>
-      </w:tr>
-      <w:tr>
-        <w:tc>
-          <w:tcPr>
-            <w:tcW w:type="dxa" w:w="1587"/>
-          </w:tcPr>
-          <w:p>
-            <w:r/>
-            <w:r>
-              <w:rPr>
-                <w:sz w:val="19"/>
-              </w:rPr>
-              <w:t>Point-plate</w:t>
-            </w:r>
-          </w:p>
-        </w:tc>
-        <w:tc>
-          <w:tcPr>
-            <w:tcW w:type="dxa" w:w="907"/>
-          </w:tcPr>
-          <w:p>
-            <w:r/>
-            <w:r>
-              <w:rPr>
-                <w:sz w:val="19"/>
-              </w:rPr>
-              <w:t>120</w:t>
-            </w:r>
-          </w:p>
-        </w:tc>
-        <w:tc>
-          <w:tcPr>
-            <w:tcW w:type="dxa" w:w="1134"/>
-          </w:tcPr>
-          <w:p>
-            <w:r/>
-            <w:r>
-              <w:rPr>
-                <w:sz w:val="19"/>
-              </w:rPr>
-            </w:r>
-          </w:p>
-        </w:tc>
-        <w:tc>
-          <w:tcPr>
-            <w:tcW w:type="dxa" w:w="1587"/>
-          </w:tcPr>
-          <w:p>
-            <w:r/>
-            <w:r>
-              <w:rPr>
-                <w:sz w:val="19"/>
-              </w:rPr>
-            </w:r>
-          </w:p>
-        </w:tc>
-        <w:tc>
-          <w:tcPr>
-            <w:tcW w:type="dxa" w:w="1474"/>
-          </w:tcPr>
-          <w:p>
-            <w:r/>
-            <w:r>
-              <w:rPr>
-                <w:sz w:val="19"/>
-              </w:rPr>
-            </w:r>
-          </w:p>
-        </w:tc>
-        <w:tc>
-          <w:tcPr>
-            <w:tcW w:type="dxa" w:w="1020"/>
-          </w:tcPr>
-          <w:p>
-            <w:r/>
-            <w:r>
-              <w:rPr>
-                <w:sz w:val="19"/>
-              </w:rPr>
-            </w:r>
-          </w:p>
-        </w:tc>
-        <w:tc>
-          <w:tcPr>
-            <w:tcW w:type="dxa" w:w="1587"/>
-          </w:tcPr>
-          <w:p>
-            <w:r/>
-            <w:r>
-              <w:rPr>
-                <w:sz w:val="19"/>
-              </w:rPr>
-            </w:r>
-          </w:p>
-        </w:tc>
-      </w:tr>
-      <w:tr>
-        <w:tc>
-          <w:tcPr>
-            <w:tcW w:type="dxa" w:w="1587"/>
-          </w:tcPr>
-          <w:p>
-            <w:r/>
-            <w:r>
-              <w:rPr>
-                <w:sz w:val="19"/>
-              </w:rPr>
-              <w:t>Point-plate</w:t>
-            </w:r>
-          </w:p>
-        </w:tc>
-        <w:tc>
-          <w:tcPr>
-            <w:tcW w:type="dxa" w:w="907"/>
-          </w:tcPr>
-          <w:p>
-            <w:r/>
-            <w:r>
-              <w:rPr>
-                <w:sz w:val="19"/>
-              </w:rPr>
-              <w:t>150</w:t>
-            </w:r>
-          </w:p>
-        </w:tc>
-        <w:tc>
-          <w:tcPr>
-            <w:tcW w:type="dxa" w:w="1134"/>
-          </w:tcPr>
-          <w:p>
-            <w:r/>
-            <w:r>
-              <w:rPr>
-                <w:sz w:val="19"/>
-              </w:rPr>
-            </w:r>
-          </w:p>
-        </w:tc>
-        <w:tc>
-          <w:tcPr>
-            <w:tcW w:type="dxa" w:w="1587"/>
-          </w:tcPr>
-          <w:p>
-            <w:r/>
-            <w:r>
-              <w:rPr>
-                <w:sz w:val="19"/>
-              </w:rPr>
-            </w:r>
-          </w:p>
-        </w:tc>
-        <w:tc>
-          <w:tcPr>
-            <w:tcW w:type="dxa" w:w="1474"/>
-          </w:tcPr>
-          <w:p>
-            <w:r/>
-            <w:r>
-              <w:rPr>
-                <w:sz w:val="19"/>
-              </w:rPr>
-            </w:r>
-          </w:p>
-        </w:tc>
-        <w:tc>
-          <w:tcPr>
-            <w:tcW w:type="dxa" w:w="1020"/>
-          </w:tcPr>
-          <w:p>
-            <w:r/>
-            <w:r>
-              <w:rPr>
-                <w:sz w:val="19"/>
-              </w:rPr>
-            </w:r>
-          </w:p>
-        </w:tc>
-        <w:tc>
-          <w:tcPr>
-            <w:tcW w:type="dxa" w:w="1587"/>
-          </w:tcPr>
-          <w:p>
-            <w:r/>
-            <w:r>
-              <w:rPr>
-                <w:sz w:val="19"/>
-              </w:rPr>
-            </w:r>
-          </w:p>
-        </w:tc>
-      </w:tr>
-    </w:tbl>
-    <w:p>
-      <w:pPr>
-        <w:spacing w:after="40"/>
-      </w:pPr>
-    </w:p>
-    <w:p>
-      <w:pPr>
-        <w:spacing w:after="40"/>
-      </w:pPr>
-      <w:r>
-        <w:rPr>
-          <w:b/>
-          <w:i w:val="0"/>
-          <w:sz w:val="20"/>
-        </w:rPr>
-        <w:t>Table 1.2: Pre-breakdown phenomena, point-point, s = 150 mm (Part 1b)</w:t>
-      </w:r>
-    </w:p>
-    <w:tbl>
-      <w:tblPr>
-        <w:tblStyle w:val="TableGrid"/>
-        <w:tblW w:type="auto" w:w="0"/>
-        <w:jc w:val="center"/>
-        <w:tblLook w:firstColumn="1" w:firstRow="1" w:lastColumn="0" w:lastRow="0" w:noHBand="0" w:noVBand="1" w:val="04A0"/>
-      </w:tblPr>
-      <w:tblGrid>
-        <w:gridCol w:w="3249"/>
-        <w:gridCol w:w="3249"/>
-        <w:gridCol w:w="3249"/>
-      </w:tblGrid>
-      <w:tr>
-        <w:tc>
-          <w:tcPr>
-            <w:tcW w:type="dxa" w:w="2551"/>
-            <w:shd w:val="clear" w:color="auto" w:fill="DCE4EE"/>
-          </w:tcPr>
-          <w:p>
-            <w:r/>
-            <w:r>
-              <w:rPr>
-                <w:b/>
-                <w:sz w:val="19"/>
-              </w:rPr>
-              <w:t>Stage</w:t>
-            </w:r>
-          </w:p>
-        </w:tc>
-        <w:tc>
-          <w:tcPr>
-            <w:tcW w:type="dxa" w:w="2268"/>
-            <w:shd w:val="clear" w:color="auto" w:fill="DCE4EE"/>
-          </w:tcPr>
-          <w:p>
-            <w:r/>
-            <w:r>
-              <w:rPr>
-                <w:b/>
-                <w:sz w:val="19"/>
-              </w:rPr>
-              <w:t>Inception voltage / kV</w:t>
-            </w:r>
-          </w:p>
-        </w:tc>
-        <w:tc>
-          <w:tcPr>
-            <w:tcW w:type="dxa" w:w="4535"/>
-            <w:shd w:val="clear" w:color="auto" w:fill="DCE4EE"/>
-          </w:tcPr>
-          <w:p>
-            <w:r/>
-            <w:r>
-              <w:rPr>
-                <w:b/>
-                <w:sz w:val="19"/>
-              </w:rPr>
-              <w:t>Observation</w:t>
-            </w:r>
-          </w:p>
-        </w:tc>
-      </w:tr>
-      <w:tr>
-        <w:tc>
-          <w:tcPr>
-            <w:tcW w:type="dxa" w:w="2551"/>
-          </w:tcPr>
-          <w:p>
-            <w:r/>
-            <w:r>
-              <w:rPr>
-                <w:sz w:val="19"/>
-              </w:rPr>
-              <w:t>Glow onset</w:t>
-            </w:r>
-          </w:p>
-        </w:tc>
-        <w:tc>
-          <w:tcPr>
-            <w:tcW w:type="dxa" w:w="2268"/>
-          </w:tcPr>
-          <w:p>
-            <w:r/>
-            <w:r>
-              <w:rPr>
-                <w:sz w:val="19"/>
-              </w:rPr>
-            </w:r>
-          </w:p>
-        </w:tc>
-        <w:tc>
-          <w:tcPr>
-            <w:tcW w:type="dxa" w:w="4535"/>
-          </w:tcPr>
-          <w:p>
-            <w:r/>
-            <w:r>
-              <w:rPr>
-                <w:sz w:val="19"/>
-              </w:rPr>
-            </w:r>
-          </w:p>
-        </w:tc>
-      </w:tr>
-      <w:tr>
-        <w:tc>
-          <w:tcPr>
-            <w:tcW w:type="dxa" w:w="2551"/>
-          </w:tcPr>
-          <w:p>
-            <w:r/>
-            <w:r>
-              <w:rPr>
-                <w:sz w:val="19"/>
-              </w:rPr>
-              <w:t>Streamer onset</w:t>
-            </w:r>
-          </w:p>
-        </w:tc>
-        <w:tc>
-          <w:tcPr>
-            <w:tcW w:type="dxa" w:w="2268"/>
-          </w:tcPr>
-          <w:p>
-            <w:r/>
-            <w:r>
-              <w:rPr>
-                <w:sz w:val="19"/>
-              </w:rPr>
-            </w:r>
-          </w:p>
-        </w:tc>
-        <w:tc>
-          <w:tcPr>
-            <w:tcW w:type="dxa" w:w="4535"/>
-          </w:tcPr>
-          <w:p>
-            <w:r/>
-            <w:r>
-              <w:rPr>
-                <w:sz w:val="19"/>
-              </w:rPr>
-            </w:r>
-          </w:p>
-        </w:tc>
-      </w:tr>
-      <w:tr>
-        <w:tc>
-          <w:tcPr>
-            <w:tcW w:type="dxa" w:w="2551"/>
-          </w:tcPr>
-          <w:p>
-            <w:r/>
-            <w:r>
-              <w:rPr>
-                <w:sz w:val="19"/>
-              </w:rPr>
-              <w:t>Spark onset (breakdown)</w:t>
-            </w:r>
-          </w:p>
-        </w:tc>
-        <w:tc>
-          <w:tcPr>
-            <w:tcW w:type="dxa" w:w="2268"/>
-          </w:tcPr>
-          <w:p>
-            <w:r/>
-            <w:r>
-              <w:rPr>
-                <w:sz w:val="19"/>
-              </w:rPr>
-            </w:r>
-          </w:p>
-        </w:tc>
-        <w:tc>
-          <w:tcPr>
-            <w:tcW w:type="dxa" w:w="4535"/>
-          </w:tcPr>
-          <w:p>
-            <w:r/>
-            <w:r>
-              <w:rPr>
-                <w:sz w:val="19"/>
-              </w:rPr>
-            </w:r>
-          </w:p>
-        </w:tc>
-      </w:tr>
-    </w:tbl>
-    <w:p>
-      <w:pPr>
-        <w:spacing w:after="40"/>
-      </w:pPr>
-    </w:p>
-    <w:p>
-      <w:pPr>
-        <w:spacing w:after="40"/>
-      </w:pPr>
-      <w:r>
-        <w:rPr>
-          <w:b/>
-          <w:i w:val="0"/>
-          <w:sz w:val="20"/>
-        </w:rPr>
-        <w:t>Table 1.3: DC breakdown, point-plate, polarity effect (Part 2)</w:t>
-      </w:r>
-    </w:p>
-    <w:tbl>
-      <w:tblPr>
-        <w:tblStyle w:val="TableGrid"/>
-        <w:tblW w:type="auto" w:w="0"/>
-        <w:jc w:val="center"/>
-        <w:tblLook w:firstColumn="1" w:firstRow="1" w:lastColumn="0" w:lastRow="0" w:noHBand="0" w:noVBand="1" w:val="04A0"/>
-      </w:tblPr>
-      <w:tblGrid>
-        <w:gridCol w:w="1949"/>
-        <w:gridCol w:w="1949"/>
-        <w:gridCol w:w="1949"/>
-        <w:gridCol w:w="1949"/>
-        <w:gridCol w:w="1949"/>
-      </w:tblGrid>
-      <w:tr>
-        <w:tc>
-          <w:tcPr>
-            <w:tcW w:type="dxa" w:w="1814"/>
-            <w:shd w:val="clear" w:color="auto" w:fill="DCE4EE"/>
-          </w:tcPr>
-          <w:p>
-            <w:r/>
-            <w:r>
-              <w:rPr>
-                <w:b/>
-                <w:sz w:val="19"/>
-              </w:rPr>
-              <w:t>Polarity</w:t>
-            </w:r>
-          </w:p>
-        </w:tc>
-        <w:tc>
-          <w:tcPr>
-            <w:tcW w:type="dxa" w:w="1134"/>
-            <w:shd w:val="clear" w:color="auto" w:fill="DCE4EE"/>
-          </w:tcPr>
-          <w:p>
-            <w:r/>
-            <w:r>
-              <w:rPr>
-                <w:b/>
-                <w:sz w:val="19"/>
-              </w:rPr>
-              <w:t>s / mm</w:t>
-            </w:r>
-          </w:p>
-        </w:tc>
-        <w:tc>
-          <w:tcPr>
-            <w:tcW w:type="dxa" w:w="1587"/>
-            <w:shd w:val="clear" w:color="auto" w:fill="DCE4EE"/>
-          </w:tcPr>
-          <w:p>
-            <w:r/>
-            <w:r>
-              <w:rPr>
-                <w:b/>
-                <w:sz w:val="19"/>
-              </w:rPr>
-              <w:t>Û_d / kV</w:t>
-            </w:r>
-          </w:p>
-        </w:tc>
-        <w:tc>
-          <w:tcPr>
-            <w:tcW w:type="dxa" w:w="2154"/>
-            <w:shd w:val="clear" w:color="auto" w:fill="DCE4EE"/>
-          </w:tcPr>
-          <w:p>
-            <w:r/>
-            <w:r>
-              <w:rPr>
-                <w:b/>
-                <w:sz w:val="19"/>
-              </w:rPr>
-              <w:t>PD inception / kV</w:t>
-            </w:r>
-          </w:p>
-        </w:tc>
-        <w:tc>
-          <w:tcPr>
-            <w:tcW w:type="dxa" w:w="2268"/>
-            <w:shd w:val="clear" w:color="auto" w:fill="DCE4EE"/>
-          </w:tcPr>
-          <w:p>
-            <w:r/>
-            <w:r>
-              <w:rPr>
-                <w:b/>
-                <w:sz w:val="19"/>
-              </w:rPr>
-              <w:t>Streamer onset / kV</w:t>
-            </w:r>
-          </w:p>
-        </w:tc>
-      </w:tr>
-      <w:tr>
-        <w:tc>
-          <w:tcPr>
-            <w:tcW w:type="dxa" w:w="1814"/>
-          </w:tcPr>
-          <w:p>
-            <w:r/>
-            <w:r>
-              <w:rPr>
-                <w:sz w:val="19"/>
-              </w:rPr>
-              <w:t>Positive point</w:t>
-            </w:r>
-          </w:p>
-        </w:tc>
-        <w:tc>
-          <w:tcPr>
-            <w:tcW w:type="dxa" w:w="1134"/>
-          </w:tcPr>
-          <w:p>
-            <w:r/>
-            <w:r>
-              <w:rPr>
-                <w:sz w:val="19"/>
-              </w:rPr>
-              <w:t>30</w:t>
-            </w:r>
-          </w:p>
-        </w:tc>
-        <w:tc>
-          <w:tcPr>
-            <w:tcW w:type="dxa" w:w="1587"/>
-          </w:tcPr>
-          <w:p>
-            <w:r/>
-            <w:r>
-              <w:rPr>
-                <w:sz w:val="19"/>
-              </w:rPr>
-            </w:r>
-          </w:p>
-        </w:tc>
-        <w:tc>
-          <w:tcPr>
-            <w:tcW w:type="dxa" w:w="2154"/>
-          </w:tcPr>
-          <w:p>
-            <w:r/>
-            <w:r>
-              <w:rPr>
-                <w:sz w:val="19"/>
-              </w:rPr>
-            </w:r>
-          </w:p>
-        </w:tc>
-        <w:tc>
-          <w:tcPr>
-            <w:tcW w:type="dxa" w:w="2268"/>
-          </w:tcPr>
-          <w:p>
-            <w:r/>
-            <w:r>
-              <w:rPr>
-                <w:sz w:val="19"/>
-              </w:rPr>
-            </w:r>
-          </w:p>
-        </w:tc>
-      </w:tr>
-      <w:tr>
-        <w:tc>
-          <w:tcPr>
-            <w:tcW w:type="dxa" w:w="1814"/>
-          </w:tcPr>
-          <w:p>
-            <w:r/>
-            <w:r>
-              <w:rPr>
-                <w:sz w:val="19"/>
-              </w:rPr>
-              <w:t>Positive point</w:t>
-            </w:r>
-          </w:p>
-        </w:tc>
-        <w:tc>
-          <w:tcPr>
-            <w:tcW w:type="dxa" w:w="1134"/>
-          </w:tcPr>
-          <w:p>
-            <w:r/>
-            <w:r>
-              <w:rPr>
-                <w:sz w:val="19"/>
-              </w:rPr>
-              <w:t>40</w:t>
-            </w:r>
-          </w:p>
-        </w:tc>
-        <w:tc>
-          <w:tcPr>
-            <w:tcW w:type="dxa" w:w="1587"/>
-          </w:tcPr>
-          <w:p>
-            <w:r/>
-            <w:r>
-              <w:rPr>
-                <w:sz w:val="19"/>
-              </w:rPr>
-            </w:r>
-          </w:p>
-        </w:tc>
-        <w:tc>
-          <w:tcPr>
-            <w:tcW w:type="dxa" w:w="2154"/>
-          </w:tcPr>
-          <w:p>
-            <w:r/>
-            <w:r>
-              <w:rPr>
-                <w:sz w:val="19"/>
-              </w:rPr>
-            </w:r>
-          </w:p>
-        </w:tc>
-        <w:tc>
-          <w:tcPr>
-            <w:tcW w:type="dxa" w:w="2268"/>
-          </w:tcPr>
-          <w:p>
-            <w:r/>
-            <w:r>
-              <w:rPr>
-                <w:sz w:val="19"/>
-              </w:rPr>
-            </w:r>
-          </w:p>
-        </w:tc>
-      </w:tr>
-      <w:tr>
-        <w:tc>
-          <w:tcPr>
-            <w:tcW w:type="dxa" w:w="1814"/>
-          </w:tcPr>
-          <w:p>
-            <w:r/>
-            <w:r>
-              <w:rPr>
-                <w:sz w:val="19"/>
-              </w:rPr>
-              <w:t>Positive point</w:t>
-            </w:r>
-          </w:p>
-        </w:tc>
-        <w:tc>
-          <w:tcPr>
-            <w:tcW w:type="dxa" w:w="1134"/>
-          </w:tcPr>
-          <w:p>
-            <w:r/>
-            <w:r>
-              <w:rPr>
-                <w:sz w:val="19"/>
-              </w:rPr>
-              <w:t>50</w:t>
-            </w:r>
-          </w:p>
-        </w:tc>
-        <w:tc>
-          <w:tcPr>
-            <w:tcW w:type="dxa" w:w="1587"/>
-          </w:tcPr>
-          <w:p>
-            <w:r/>
-            <w:r>
-              <w:rPr>
-                <w:sz w:val="19"/>
-              </w:rPr>
-            </w:r>
-          </w:p>
-        </w:tc>
-        <w:tc>
-          <w:tcPr>
-            <w:tcW w:type="dxa" w:w="2154"/>
-          </w:tcPr>
-          <w:p>
-            <w:r/>
-            <w:r>
-              <w:rPr>
-                <w:sz w:val="19"/>
-              </w:rPr>
-            </w:r>
-          </w:p>
-        </w:tc>
-        <w:tc>
-          <w:tcPr>
-            <w:tcW w:type="dxa" w:w="2268"/>
-          </w:tcPr>
-          <w:p>
-            <w:r/>
-            <w:r>
-              <w:rPr>
-                <w:sz w:val="19"/>
-              </w:rPr>
-            </w:r>
-          </w:p>
-        </w:tc>
-      </w:tr>
-      <w:tr>
-        <w:tc>
-          <w:tcPr>
-            <w:tcW w:type="dxa" w:w="1814"/>
-          </w:tcPr>
-          <w:p>
-            <w:r/>
-            <w:r>
-              <w:rPr>
-                <w:sz w:val="19"/>
-              </w:rPr>
-              <w:t>Positive point</w:t>
-            </w:r>
-          </w:p>
-        </w:tc>
-        <w:tc>
-          <w:tcPr>
-            <w:tcW w:type="dxa" w:w="1134"/>
-          </w:tcPr>
-          <w:p>
-            <w:r/>
-            <w:r>
-              <w:rPr>
-                <w:sz w:val="19"/>
-              </w:rPr>
-              <w:t>70</w:t>
-            </w:r>
-          </w:p>
-        </w:tc>
-        <w:tc>
-          <w:tcPr>
-            <w:tcW w:type="dxa" w:w="1587"/>
-          </w:tcPr>
-          <w:p>
-            <w:r/>
-            <w:r>
-              <w:rPr>
-                <w:sz w:val="19"/>
-              </w:rPr>
-            </w:r>
-          </w:p>
-        </w:tc>
-        <w:tc>
-          <w:tcPr>
-            <w:tcW w:type="dxa" w:w="2154"/>
-          </w:tcPr>
-          <w:p>
-            <w:r/>
-            <w:r>
-              <w:rPr>
-                <w:sz w:val="19"/>
-              </w:rPr>
-            </w:r>
-          </w:p>
-        </w:tc>
-        <w:tc>
-          <w:tcPr>
-            <w:tcW w:type="dxa" w:w="2268"/>
-          </w:tcPr>
-          <w:p>
-            <w:r/>
-            <w:r>
-              <w:rPr>
-                <w:sz w:val="19"/>
-              </w:rPr>
-            </w:r>
-          </w:p>
-        </w:tc>
-      </w:tr>
-      <w:tr>
-        <w:tc>
-          <w:tcPr>
-            <w:tcW w:type="dxa" w:w="1814"/>
-          </w:tcPr>
-          <w:p>
-            <w:r/>
-            <w:r>
-              <w:rPr>
-                <w:sz w:val="19"/>
-              </w:rPr>
-              <w:t>Positive point</w:t>
-            </w:r>
-          </w:p>
-        </w:tc>
-        <w:tc>
-          <w:tcPr>
-            <w:tcW w:type="dxa" w:w="1134"/>
-          </w:tcPr>
-          <w:p>
-            <w:r/>
-            <w:r>
-              <w:rPr>
-                <w:sz w:val="19"/>
-              </w:rPr>
-              <w:t>100</w:t>
-            </w:r>
-          </w:p>
-        </w:tc>
-        <w:tc>
-          <w:tcPr>
-            <w:tcW w:type="dxa" w:w="1587"/>
-          </w:tcPr>
-          <w:p>
-            <w:r/>
-            <w:r>
-              <w:rPr>
-                <w:sz w:val="19"/>
-              </w:rPr>
-            </w:r>
-          </w:p>
-        </w:tc>
-        <w:tc>
-          <w:tcPr>
-            <w:tcW w:type="dxa" w:w="2154"/>
-          </w:tcPr>
-          <w:p>
-            <w:r/>
-            <w:r>
-              <w:rPr>
-                <w:sz w:val="19"/>
-              </w:rPr>
-            </w:r>
-          </w:p>
-        </w:tc>
-        <w:tc>
-          <w:tcPr>
-            <w:tcW w:type="dxa" w:w="2268"/>
-          </w:tcPr>
-          <w:p>
-            <w:r/>
-            <w:r>
-              <w:rPr>
-                <w:sz w:val="19"/>
-              </w:rPr>
-            </w:r>
-          </w:p>
-        </w:tc>
-      </w:tr>
-      <w:tr>
-        <w:tc>
-          <w:tcPr>
-            <w:tcW w:type="dxa" w:w="1814"/>
-          </w:tcPr>
-          <w:p>
-            <w:r/>
-            <w:r>
-              <w:rPr>
-                <w:sz w:val="19"/>
-              </w:rPr>
-              <w:t>Positive point</w:t>
-            </w:r>
-          </w:p>
-        </w:tc>
-        <w:tc>
-          <w:tcPr>
-            <w:tcW w:type="dxa" w:w="1134"/>
-          </w:tcPr>
-          <w:p>
-            <w:r/>
-            <w:r>
-              <w:rPr>
-                <w:sz w:val="19"/>
-              </w:rPr>
-              <w:t>120</w:t>
-            </w:r>
-          </w:p>
-        </w:tc>
-        <w:tc>
-          <w:tcPr>
-            <w:tcW w:type="dxa" w:w="1587"/>
-          </w:tcPr>
-          <w:p>
-            <w:r/>
-            <w:r>
-              <w:rPr>
-                <w:sz w:val="19"/>
-              </w:rPr>
-            </w:r>
-          </w:p>
-        </w:tc>
-        <w:tc>
-          <w:tcPr>
-            <w:tcW w:type="dxa" w:w="2154"/>
-          </w:tcPr>
-          <w:p>
-            <w:r/>
-            <w:r>
-              <w:rPr>
-                <w:sz w:val="19"/>
-              </w:rPr>
-            </w:r>
-          </w:p>
-        </w:tc>
-        <w:tc>
-          <w:tcPr>
-            <w:tcW w:type="dxa" w:w="2268"/>
-          </w:tcPr>
-          <w:p>
-            <w:r/>
-            <w:r>
-              <w:rPr>
-                <w:sz w:val="19"/>
-              </w:rPr>
-            </w:r>
-          </w:p>
-        </w:tc>
-      </w:tr>
-      <w:tr>
-        <w:tc>
-          <w:tcPr>
-            <w:tcW w:type="dxa" w:w="1814"/>
-          </w:tcPr>
-          <w:p>
-            <w:r/>
-            <w:r>
-              <w:rPr>
-                <w:sz w:val="19"/>
-              </w:rPr>
-              <w:t>Positive point</w:t>
-            </w:r>
-          </w:p>
-        </w:tc>
-        <w:tc>
-          <w:tcPr>
-            <w:tcW w:type="dxa" w:w="1134"/>
-          </w:tcPr>
-          <w:p>
-            <w:r/>
-            <w:r>
-              <w:rPr>
-                <w:sz w:val="19"/>
-              </w:rPr>
-              <w:t>150</w:t>
-            </w:r>
-          </w:p>
-        </w:tc>
-        <w:tc>
-          <w:tcPr>
-            <w:tcW w:type="dxa" w:w="1587"/>
-          </w:tcPr>
-          <w:p>
-            <w:r/>
-            <w:r>
-              <w:rPr>
-                <w:sz w:val="19"/>
-              </w:rPr>
-            </w:r>
-          </w:p>
-        </w:tc>
-        <w:tc>
-          <w:tcPr>
-            <w:tcW w:type="dxa" w:w="2154"/>
-          </w:tcPr>
-          <w:p>
-            <w:r/>
-            <w:r>
-              <w:rPr>
-                <w:sz w:val="19"/>
-              </w:rPr>
-            </w:r>
-          </w:p>
-        </w:tc>
-        <w:tc>
-          <w:tcPr>
-            <w:tcW w:type="dxa" w:w="2268"/>
-          </w:tcPr>
-          <w:p>
-            <w:r/>
-            <w:r>
-              <w:rPr>
-                <w:sz w:val="19"/>
-              </w:rPr>
-            </w:r>
-          </w:p>
-        </w:tc>
-      </w:tr>
-      <w:tr>
-        <w:tc>
-          <w:tcPr>
-            <w:tcW w:type="dxa" w:w="1814"/>
-          </w:tcPr>
-          <w:p>
-            <w:r/>
-            <w:r>
-              <w:rPr>
-                <w:sz w:val="19"/>
-              </w:rPr>
-              <w:t>Negative point</w:t>
-            </w:r>
-          </w:p>
-        </w:tc>
-        <w:tc>
-          <w:tcPr>
-            <w:tcW w:type="dxa" w:w="1134"/>
-          </w:tcPr>
-          <w:p>
-            <w:r/>
-            <w:r>
-              <w:rPr>
-                <w:sz w:val="19"/>
-              </w:rPr>
-              <w:t>30</w:t>
-            </w:r>
-          </w:p>
-        </w:tc>
-        <w:tc>
-          <w:tcPr>
-            <w:tcW w:type="dxa" w:w="1587"/>
-          </w:tcPr>
-          <w:p>
-            <w:r/>
-            <w:r>
-              <w:rPr>
-                <w:sz w:val="19"/>
-              </w:rPr>
-            </w:r>
-          </w:p>
-        </w:tc>
-        <w:tc>
-          <w:tcPr>
-            <w:tcW w:type="dxa" w:w="2154"/>
-          </w:tcPr>
-          <w:p>
-            <w:r/>
-            <w:r>
-              <w:rPr>
-                <w:sz w:val="19"/>
-              </w:rPr>
-            </w:r>
-          </w:p>
-        </w:tc>
-        <w:tc>
-          <w:tcPr>
-            <w:tcW w:type="dxa" w:w="2268"/>
-          </w:tcPr>
-          <w:p>
-            <w:r/>
-            <w:r>
-              <w:rPr>
-                <w:sz w:val="19"/>
-              </w:rPr>
-            </w:r>
-          </w:p>
-        </w:tc>
-      </w:tr>
-      <w:tr>
-        <w:tc>
-          <w:tcPr>
-            <w:tcW w:type="dxa" w:w="1814"/>
-          </w:tcPr>
-          <w:p>
-            <w:r/>
-            <w:r>
-              <w:rPr>
-                <w:sz w:val="19"/>
-              </w:rPr>
-              <w:t>Negative point</w:t>
-            </w:r>
-          </w:p>
-        </w:tc>
-        <w:tc>
-          <w:tcPr>
-            <w:tcW w:type="dxa" w:w="1134"/>
-          </w:tcPr>
-          <w:p>
-            <w:r/>
-            <w:r>
-              <w:rPr>
-                <w:sz w:val="19"/>
-              </w:rPr>
-              <w:t>40</w:t>
-            </w:r>
-          </w:p>
-        </w:tc>
-        <w:tc>
-          <w:tcPr>
-            <w:tcW w:type="dxa" w:w="1587"/>
-          </w:tcPr>
-          <w:p>
-            <w:r/>
-            <w:r>
-              <w:rPr>
-                <w:sz w:val="19"/>
-              </w:rPr>
-            </w:r>
-          </w:p>
-        </w:tc>
-        <w:tc>
-          <w:tcPr>
-            <w:tcW w:type="dxa" w:w="2154"/>
-          </w:tcPr>
-          <w:p>
-            <w:r/>
-            <w:r>
-              <w:rPr>
-                <w:sz w:val="19"/>
-              </w:rPr>
-            </w:r>
-          </w:p>
-        </w:tc>
-        <w:tc>
-          <w:tcPr>
-            <w:tcW w:type="dxa" w:w="2268"/>
-          </w:tcPr>
-          <w:p>
-            <w:r/>
-            <w:r>
-              <w:rPr>
-                <w:sz w:val="19"/>
-              </w:rPr>
-            </w:r>
-          </w:p>
-        </w:tc>
-      </w:tr>
-      <w:tr>
-        <w:tc>
-          <w:tcPr>
-            <w:tcW w:type="dxa" w:w="1814"/>
-          </w:tcPr>
-          <w:p>
-            <w:r/>
-            <w:r>
-              <w:rPr>
-                <w:sz w:val="19"/>
-              </w:rPr>
-              <w:t>Negative point</w:t>
-            </w:r>
-          </w:p>
-        </w:tc>
-        <w:tc>
-          <w:tcPr>
-            <w:tcW w:type="dxa" w:w="1134"/>
-          </w:tcPr>
-          <w:p>
-            <w:r/>
-            <w:r>
-              <w:rPr>
-                <w:sz w:val="19"/>
-              </w:rPr>
-              <w:t>50</w:t>
-            </w:r>
-          </w:p>
-        </w:tc>
-        <w:tc>
-          <w:tcPr>
-            <w:tcW w:type="dxa" w:w="1587"/>
-          </w:tcPr>
-          <w:p>
-            <w:r/>
-            <w:r>
-              <w:rPr>
-                <w:sz w:val="19"/>
-              </w:rPr>
-            </w:r>
-          </w:p>
-        </w:tc>
-        <w:tc>
-          <w:tcPr>
-            <w:tcW w:type="dxa" w:w="2154"/>
-          </w:tcPr>
-          <w:p>
-            <w:r/>
-            <w:r>
-              <w:rPr>
-                <w:sz w:val="19"/>
-              </w:rPr>
-            </w:r>
-          </w:p>
-        </w:tc>
-        <w:tc>
-          <w:tcPr>
-            <w:tcW w:type="dxa" w:w="2268"/>
-          </w:tcPr>
-          <w:p>
-            <w:r/>
-            <w:r>
-              <w:rPr>
-                <w:sz w:val="19"/>
-              </w:rPr>
-            </w:r>
-          </w:p>
-        </w:tc>
-      </w:tr>
-      <w:tr>
-        <w:tc>
-          <w:tcPr>
-            <w:tcW w:type="dxa" w:w="1814"/>
-          </w:tcPr>
-          <w:p>
-            <w:r/>
-            <w:r>
-              <w:rPr>
-                <w:sz w:val="19"/>
-              </w:rPr>
-              <w:t>Negative point</w:t>
-            </w:r>
-          </w:p>
-        </w:tc>
-        <w:tc>
-          <w:tcPr>
-            <w:tcW w:type="dxa" w:w="1134"/>
-          </w:tcPr>
-          <w:p>
-            <w:r/>
-            <w:r>
-              <w:rPr>
-                <w:sz w:val="19"/>
-              </w:rPr>
-              <w:t>60</w:t>
-            </w:r>
-          </w:p>
-        </w:tc>
-        <w:tc>
-          <w:tcPr>
-            <w:tcW w:type="dxa" w:w="1587"/>
-          </w:tcPr>
-          <w:p>
-            <w:r/>
-            <w:r>
-              <w:rPr>
-                <w:sz w:val="19"/>
-              </w:rPr>
-            </w:r>
-          </w:p>
-        </w:tc>
-        <w:tc>
-          <w:tcPr>
-            <w:tcW w:type="dxa" w:w="2154"/>
-          </w:tcPr>
-          <w:p>
-            <w:r/>
-            <w:r>
-              <w:rPr>
-                <w:sz w:val="19"/>
-              </w:rPr>
-            </w:r>
-          </w:p>
-        </w:tc>
-        <w:tc>
-          <w:tcPr>
-            <w:tcW w:type="dxa" w:w="2268"/>
-          </w:tcPr>
-          <w:p>
-            <w:r/>
-            <w:r>
-              <w:rPr>
-                <w:sz w:val="19"/>
-              </w:rPr>
-            </w:r>
-          </w:p>
-        </w:tc>
-      </w:tr>
-    </w:tbl>
-    <w:p>
-      <w:pPr>
-        <w:spacing w:after="40"/>
-      </w:pPr>
-    </w:p>
-    <w:p>
-      <w:r>
-        <w:rPr>
-          <w:b w:val="0"/>
-          <w:i w:val="0"/>
-        </w:rPr>
-        <w:t>Create diagrams of breakdown voltage against electrode spacing. Your diagrams should include:</w:t>
-      </w:r>
-    </w:p>
-    <w:p>
-      <w:pPr>
-        <w:pStyle w:val="ListBullet"/>
-      </w:pPr>
-      <w:r>
-        <w:t>Four curves: AC plate-plate, AC point-plate, DC point-plate with positive point, DC point-plate with negative point</w:t>
-      </w:r>
-    </w:p>
-    <w:p>
-      <w:pPr>
-        <w:pStyle w:val="ListBullet"/>
-      </w:pPr>
-      <w:r>
-        <w:t>For each DC polarity, the partial discharge inception voltage as a function of spacing, in the same diagram as its breakdown curve</w:t>
-      </w:r>
-    </w:p>
-    <w:p>
-      <w:pPr>
-        <w:pStyle w:val="ListBullet"/>
-      </w:pPr>
-      <w:r>
-        <w:t>Axes: breakdown voltage Û_d (kV) on the y-axis and electrode spacing s (mm) on the x-axis</w:t>
-      </w:r>
-    </w:p>
-    <w:p>
-      <w:pPr>
-        <w:pStyle w:val="ListBullet"/>
-      </w:pPr>
-      <w:r>
-        <w:t>Measured data points with trend lines, and a legend identifying each configuration and polarity</w:t>
-      </w:r>
-    </w:p>
-    <w:p>
-      <w:pPr>
-        <w:spacing w:after="200"/>
-      </w:pPr>
-      <w:r>
-        <w:rPr>
-          <w:b w:val="0"/>
-          <w:i/>
-          <w:color w:val="808080"/>
-        </w:rPr>
-        <w:t>[Insert Figure 1.1: AC breakdown voltage against spacing]</w:t>
-      </w:r>
-    </w:p>
-    <w:p>
-      <w:pPr>
-        <w:spacing w:after="200"/>
-      </w:pPr>
-      <w:r>
-        <w:rPr>
-          <w:b w:val="0"/>
-          <w:i/>
-          <w:color w:val="808080"/>
-        </w:rPr>
-        <w:t>[Insert Figure 1.2: DC breakdown and PD inception voltage against spacing, both polarities]</w:t>
-      </w:r>
-    </w:p>
-    <w:p>
-      <w:pPr>
-        <w:pStyle w:val="Heading2"/>
-      </w:pPr>
-      <w:r>
-        <w:t>1.3 Analysis: Breakdown Distance, Voltage and Configuration</w:t>
-      </w:r>
-    </w:p>
-    <w:p>
-      <w:r>
-        <w:rPr>
-          <w:b w:val="0"/>
-          <w:i w:val="0"/>
-        </w:rPr>
-        <w:t>Analyse and discuss the relationships between breakdown voltage, electrode spacing and electrode configuration. Address the following:</w:t>
+        <w:t>1.1 Lightning Impulse (Demonstration)</w:t>
       </w:r>
     </w:p>
     <w:p>
@@ -3134,7 +459,7 @@
         <w:tab/>
       </w:r>
       <w:r>
-        <w:t>Describe how breakdown voltage varies with electrode spacing for each configuration. Is the relationship linear or non-linear?</w:t>
+        <w:t>What do the numbers 1.2 and 50 in a 1.2/50 µs lightning impulse describe?</w:t>
       </w:r>
     </w:p>
     <w:p>
@@ -3152,7 +477,7 @@
         <w:tab/>
       </w:r>
       <w:r>
-        <w:t>Compare plate-plate (uniform field) and point-plate (non-uniform field) breakdown. Use your values of η and E_max to explain the difference.</w:t>
+        <w:t>How does the multi-stage impulse generator reach a voltage much higher than its charging voltage?</w:t>
       </w:r>
     </w:p>
     <w:p>
@@ -3170,7 +495,28 @@
         <w:tab/>
       </w:r>
       <w:r>
-        <w:t>Explain the physical mechanisms responsible for the observed differences, considering field strength distribution, Townsend ionisation and streamer formation.</w:t>
+        <w:t>The recorded impulse was chopped. What does this mean, and what can cause it?</w:t>
+      </w:r>
+    </w:p>
+    <w:p>
+      <w:pPr>
+        <w:spacing w:after="200"/>
+      </w:pPr>
+      <w:r>
+        <w:rPr>
+          <w:b w:val="0"/>
+          <w:i/>
+          <w:color w:val="808080"/>
+        </w:rPr>
+        <w:t>[Write your answers here.]</w:t>
+      </w:r>
+    </w:p>
+    <w:p>
+      <w:pPr>
+        <w:pStyle w:val="Heading2"/>
+      </w:pPr>
+      <w:r>
+        <w:t>1.2 Tesla Transformer (Demonstration)</w:t>
       </w:r>
     </w:p>
     <w:p>
@@ -3184,11 +530,11 @@
         <w:rPr>
           <w:b/>
         </w:rPr>
-        <w:t>4.</w:t>
+        <w:t>1.</w:t>
         <w:tab/>
       </w:r>
       <w:r>
-        <w:t>Analyse the polarity effect: how does the breakdown voltage differ between positive and negative point configurations, and what are the underlying physical reasons (space charge)?</w:t>
+        <w:t>The output voltage of a Tesla transformer is set mainly by resonance, not by the turns ratio. Explain this in one or two sentences.</w:t>
       </w:r>
     </w:p>
     <w:p>
@@ -3202,11 +548,11 @@
         <w:rPr>
           <w:b/>
         </w:rPr>
-        <w:t>5.</w:t>
+        <w:t>2.</w:t>
         <w:tab/>
       </w:r>
       <w:r>
-        <w:t>Relate the pre-breakdown stages in Table 1.2 and the partial discharge inception in Table 1.3 to the breakdown process.</w:t>
+        <w:t>With a 14 kV peak supply and a 2 kV spark gap, show why the gap fires 28 times per 50 Hz cycle.</w:t>
       </w:r>
     </w:p>
     <w:p>
@@ -3220,11 +566,11 @@
         <w:rPr>
           <w:b/>
         </w:rPr>
-        <w:t>6.</w:t>
+        <w:t>3.</w:t>
         <w:tab/>
       </w:r>
       <w:r>
-        <w:t>Discuss practical implications for the design of high voltage equipment and insulation coordination in power systems.</w:t>
+        <w:t>Why did the fluorescent tube light up without any wires connected to it?</w:t>
       </w:r>
     </w:p>
     <w:p>
@@ -3237,7 +583,82 @@
           <w:i/>
           <w:color w:val="808080"/>
         </w:rPr>
-        <w:t>[Write your analysis and discussion here.]</w:t>
+        <w:t>[Write your answers here.]</w:t>
+      </w:r>
+    </w:p>
+    <w:p>
+      <w:pPr>
+        <w:pStyle w:val="Heading2"/>
+      </w:pPr>
+      <w:r>
+        <w:t>1.3 Partial Discharges in Solids (Experiment)</w:t>
+      </w:r>
+    </w:p>
+    <w:p>
+      <w:pPr>
+        <w:tabs>
+          <w:tab w:pos="425" w:val="left"/>
+        </w:tabs>
+        <w:ind w:left="425" w:hanging="425"/>
+      </w:pPr>
+      <w:r>
+        <w:rPr>
+          <w:b/>
+        </w:rPr>
+        <w:t>1.</w:t>
+        <w:tab/>
+      </w:r>
+      <w:r>
+        <w:t>What is a partial discharge, and why is it harmful to insulation even though no complete breakdown occurs?</w:t>
+      </w:r>
+    </w:p>
+    <w:p>
+      <w:pPr>
+        <w:tabs>
+          <w:tab w:pos="425" w:val="left"/>
+        </w:tabs>
+        <w:ind w:left="425" w:hanging="425"/>
+      </w:pPr>
+      <w:r>
+        <w:rPr>
+          <w:b/>
+        </w:rPr>
+        <w:t>2.</w:t>
+        <w:tab/>
+      </w:r>
+      <w:r>
+        <w:t>Where on the sine wave did the discharge pulses appear, and why there?</w:t>
+      </w:r>
+    </w:p>
+    <w:p>
+      <w:pPr>
+        <w:tabs>
+          <w:tab w:pos="425" w:val="left"/>
+        </w:tabs>
+        <w:ind w:left="425" w:hanging="425"/>
+      </w:pPr>
+      <w:r>
+        <w:rPr>
+          <w:b/>
+        </w:rPr>
+        <w:t>3.</w:t>
+        <w:tab/>
+      </w:r>
+      <w:r>
+        <w:t>What is an electrical tree, and how is it related to partial discharges?</w:t>
+      </w:r>
+    </w:p>
+    <w:p>
+      <w:pPr>
+        <w:spacing w:after="200"/>
+      </w:pPr>
+      <w:r>
+        <w:rPr>
+          <w:b w:val="0"/>
+          <w:i/>
+          <w:color w:val="808080"/>
+        </w:rPr>
+        <w:t>[Write your answers here.]</w:t>
       </w:r>
     </w:p>
     <w:p>
@@ -6541,7 +3962,7 @@
           <w:b w:val="0"/>
           <w:i w:val="0"/>
         </w:rPr>
-        <w:t>Attach photographs with a short caption each: electrode configurations and HV setup; CT test setup and measurement equipment; distance relays, settings and network model; simulator screens. Not counted in the page limits.</w:t>
+        <w:t>Attach photographs with a short caption each: HV demonstrations (optional); CT test setup and measurement equipment; distance relays, settings and network model; simulator screens. Not counted in the page limits.</w:t>
       </w:r>
     </w:p>
     <w:p>

</xml_diff>